<commit_message>
fix: complete T2-17 diagnostic and comparison unit boundaries
</commit_message>
<xml_diff>
--- a/docs/evidence/plan2/T2-17/units.docx
+++ b/docs/evidence/plan2/T2-17/units.docx
@@ -41,7 +41,7 @@
         <w:spacing w:after="130"/>
       </w:pPr>
       <w:r>
-        <w:t xml:space="preserve">分析 ID analysis_0278f6f3-1c20-426d-97fc-c6dceb13eb5c；输入修订 R9；状态 已完成</w:t>
+        <w:t xml:space="preserve">分析 ID analysis_87350a25-0fd1-422b-bedf-5de6798cf65b；输入修订 R9；状态 已完成</w:t>
       </w:r>
     </w:p>
     <w:p>
@@ -49,7 +49,7 @@
         <w:spacing w:after="130"/>
       </w:pPr>
       <w:r>
-        <w:t xml:space="preserve">分析时间 2026-10-05T11:24:34Z；报告生成时间 2026-10-05T11:24:34.939Z（ISO 8601）</w:t>
+        <w:t xml:space="preserve">分析时间 2026-10-05T11:43:24Z；报告生成时间 2026-10-05T11:43:24.716Z（ISO 8601）</w:t>
       </w:r>
     </w:p>
     <w:p>
@@ -57,7 +57,7 @@
         <w:spacing w:after="130"/>
       </w:pPr>
       <w:r>
-        <w:t xml:space="preserve">运行来源 formal-model；请求 request_60c5625b-2462-4760-9f75-45d01de9f9dc；实际阶段 模型检查 (2026-10-05T11:24:34Z) → 刚度组装 (2026-10-05T11:24:34Z) → 方程求解 (2026-10-05T11:24:34Z) → 结果恢复 (2026-10-05T11:24:34Z)。</w:t>
+        <w:t xml:space="preserve">运行来源 formal-model；请求 request_809ecda8-811a-449c-a74b-7c1dd7b303fb；实际阶段 模型检查 (2026-10-05T11:43:24Z) → 刚度组装 (2026-10-05T11:43:24Z) → 方程求解 (2026-10-05T11:43:24Z) → 结果恢复 (2026-10-05T11:43:24Z)。</w:t>
       </w:r>
     </w:p>
     <w:p>

</xml_diff>